<commit_message>
Documentation update, error messages and repository cleanup
- DEMO_GUIDE, PRESENTATION_CHECKLIST and docs/COMPLETE_WALKTHROUGH added/updated
- Report and slides updated in docs/
- Smarter user-facing error messages for the Groq integration
- Login page simplification and test suite updates (39 tests)
</commit_message>
<xml_diff>
--- a/docs/DocuQuery_Project_Report.docx
+++ b/docs/DocuQuery_Project_Report.docx
@@ -807,7 +807,7 @@
         <w:rPr>
           <w:sz w:val="22"/>
         </w:rPr>
-        <w:t>Usability: responsive single-page workspace; works in sandboxed preview iframes (token-in-URL authentication).</w:t>
+        <w:t>Usability: responsive single-page workspace; works when embedded in third-party iframes (token-based authentication).</w:t>
       </w:r>
     </w:p>
     <w:p>
@@ -829,7 +829,7 @@
         <w:rPr>
           <w:sz w:val="22"/>
         </w:rPr>
-        <w:t>Testability: 33 automated pytest cases covering auth, repository, RAG, PDF parsing and APIs.</w:t>
+        <w:t>Testability: 38+ automated pytest cases covering auth, repository, RAG, PDF parsing and APIs.</w:t>
       </w:r>
     </w:p>
     <w:p>
@@ -1497,7 +1497,7 @@
           <w:b w:val="0"/>
           <w:sz w:val="22"/>
         </w:rPr>
-        <w:t>Passwords are hashed with Werkzeug's scrypt-based generate_password_hash. Successful login issues a signed token (itsdangerous) accepted three ways — Authorization Bearer header, ?token= URL parameter, or cookie — which makes the app work inside sandboxed preview iframes where cookies and custom headers can be stripped. Google Sign-In verifies Google ID tokens server-side and auto-creates or joins accounts by verified email.</w:t>
+        <w:t>Passwords are hashed with Werkzeug's scrypt-based generate_password_hash. Successful login issues a signed token (itsdangerous) accepted three ways — Authorization Bearer header, ?token= URL parameter, or cookie — which makes the app work inside embedded preview iframes where cookies and custom headers can be stripped. Google Sign-In verifies Google ID tokens server-side and auto-creates or joins accounts by verified email.</w:t>
       </w:r>
     </w:p>
     <w:p>
@@ -1537,7 +1537,7 @@
           <w:b w:val="0"/>
           <w:sz w:val="22"/>
         </w:rPr>
-        <w:t>The project carries 33 automated tests (pytest) and was additionally verified through real browser end-to-end scripts (headless Chrome) exercising register → upload → brief → Q&amp;A → download → profile → clear-history.</w:t>
+        <w:t>The project carries 38+ automated tests (pytest) and was additionally verified through real browser end-to-end scripts (headless Chrome) exercising register → upload → brief → Q&amp;A → download → profile → clear-history.</w:t>
       </w:r>
     </w:p>
     <w:tbl>
@@ -1699,7 +1699,7 @@
           <w:b w:val="0"/>
           <w:sz w:val="22"/>
         </w:rPr>
-        <w:t>Result: 33/33 tests pass. Browser tests: 9/9 scenarios pass (sandboxed-iframe suite earlier verified 6/6 including the sign-in flow).</w:t>
+        <w:t>Result: 38+ tests pass. Browser end-to-end scenarios (register, upload, brief, Q&amp;A, download, profile) were verified in headless Chrome.</w:t>
       </w:r>
     </w:p>
     <w:p>
@@ -1762,7 +1762,7 @@
         <w:rPr>
           <w:sz w:val="22"/>
         </w:rPr>
-        <w:t>Works in three environments: normal tab, third-party iframe, fully sandboxed iframe.</w:t>
+        <w:t>Works in normal browser tabs and when embedded in third-party iframes.</w:t>
       </w:r>
     </w:p>
     <w:p>

</xml_diff>